<commit_message>
docs: update README and submission doc with live Vercel URLs and credentials
</commit_message>
<xml_diff>
--- a/Darukaa_Earth_FullStack_Submission.docx
+++ b/Darukaa_Earth_FullStack_Submission.docx
@@ -11,7 +11,7 @@
           <w:color w:val="1B4D3E"/>
           <w:sz w:val="44"/>
         </w:rPr>
-        <w:t>Darukaa.Earth — Full-Stack Developer Challenge Submission</w:t>
+        <w:t>Darukaa.Earth — Full-Stack Developer Hackathon Challenge Submission</w:t>
       </w:r>
     </w:p>
     <w:p>
@@ -21,7 +21,7 @@
           <w:color w:val="556B2F"/>
           <w:sz w:val="26"/>
         </w:rPr>
-        <w:t>Geospatial Data Analytics Platform for Carbon &amp; Biodiversity Restoration</w:t>
+        <w:t>Geospatial Data Analytics Platform for Carbon &amp; Biodiversity Monitoring</w:t>
       </w:r>
     </w:p>
     <w:p/>
@@ -30,72 +30,220 @@
         <w:pStyle w:val="Heading1"/>
       </w:pPr>
       <w:r>
-        <w:t>1. Project Links &amp; Submission Overview</w:t>
+        <w:t>1. Submission Links &amp; Deliverables</w:t>
       </w:r>
     </w:p>
     <w:p>
       <w:r>
-        <w:rPr>
-          <w:b/>
-        </w:rPr>
-        <w:t xml:space="preserve">GitHub Repository Link: </w:t>
-      </w:r>
-      <w:r>
-        <w:t>https://github.com/Surajgore007/Darukaa.Earth-Fullstack-project</w:t>
-        <w:br/>
-      </w:r>
-      <w:r>
-        <w:rPr>
-          <w:b/>
-        </w:rPr>
-        <w:t xml:space="preserve">Repository Access: </w:t>
-      </w:r>
-      <w:r>
-        <w:t>Public (accessible directly without invitations; access granted to reviewer accounts)</w:t>
-        <w:br/>
-      </w:r>
-      <w:r>
-        <w:rPr>
-          <w:b/>
-        </w:rPr>
-        <w:t xml:space="preserve">Candidate Name: </w:t>
-      </w:r>
-      <w:r>
-        <w:t>Suraj Gore</w:t>
-        <w:br/>
-      </w:r>
-      <w:r>
-        <w:rPr>
-          <w:b/>
-        </w:rPr>
-        <w:t xml:space="preserve">Project Name: </w:t>
-      </w:r>
-      <w:r>
-        <w:t>Darukaa.Earth — Full-Stack Geospatial Monitoring Dashboard</w:t>
-        <w:br/>
-      </w:r>
-      <w:r>
-        <w:rPr>
-          <w:b/>
-        </w:rPr>
-        <w:t xml:space="preserve">Tech Stack Summary: </w:t>
-      </w:r>
-      <w:r>
-        <w:t>React 18, Vite, TypeScript, Mapbox GL JS, Mapbox Draw, Chart.js, FastAPI, PostgreSQL (PostGIS), Alembic, Docker, Husky, GitHub Actions</w:t>
-        <w:br/>
+        <w:t>This submission document strictly satisfies all requirements specified in the Darukaa.Earth Full-Stack Developer Hackathon Challenge guidelines:</w:t>
       </w:r>
     </w:p>
+    <w:tbl>
+      <w:tblPr>
+        <w:tblW w:type="auto" w:w="0"/>
+        <w:jc w:val="center"/>
+        <w:tblLayout w:type="fixed"/>
+        <w:tblLook w:firstColumn="1" w:firstRow="1" w:lastColumn="0" w:lastRow="0" w:noHBand="0" w:noVBand="1" w:val="04A0"/>
+      </w:tblPr>
+      <w:tblGrid>
+        <w:gridCol w:w="4680"/>
+        <w:gridCol w:w="4680"/>
+      </w:tblGrid>
+      <w:tr>
+        <w:tc>
+          <w:tcPr>
+            <w:tcW w:type="dxa" w:w="4680"/>
+            <w:shd w:val="clear" w:color="auto" w:fill="EAEFEA"/>
+          </w:tcPr>
+          <w:p>
+            <w:r>
+              <w:rPr>
+                <w:b/>
+              </w:rPr>
+              <w:t>Candidate Name</w:t>
+            </w:r>
+          </w:p>
+        </w:tc>
+        <w:tc>
+          <w:tcPr>
+            <w:tcW w:type="dxa" w:w="4680"/>
+          </w:tcPr>
+          <w:p>
+            <w:r>
+              <w:t>Suraj Gore</w:t>
+            </w:r>
+          </w:p>
+        </w:tc>
+      </w:tr>
+      <w:tr>
+        <w:tc>
+          <w:tcPr>
+            <w:tcW w:type="dxa" w:w="4680"/>
+            <w:shd w:val="clear" w:color="auto" w:fill="EAEFEA"/>
+          </w:tcPr>
+          <w:p>
+            <w:r>
+              <w:rPr>
+                <w:b/>
+              </w:rPr>
+              <w:t>Project Name</w:t>
+            </w:r>
+          </w:p>
+        </w:tc>
+        <w:tc>
+          <w:tcPr>
+            <w:tcW w:type="dxa" w:w="4680"/>
+          </w:tcPr>
+          <w:p>
+            <w:r>
+              <w:t>Darukaa.Earth — Full-Stack Geospatial Data Analytics Platform</w:t>
+            </w:r>
+          </w:p>
+        </w:tc>
+      </w:tr>
+      <w:tr>
+        <w:tc>
+          <w:tcPr>
+            <w:tcW w:type="dxa" w:w="4680"/>
+            <w:shd w:val="clear" w:color="auto" w:fill="EAEFEA"/>
+          </w:tcPr>
+          <w:p>
+            <w:r>
+              <w:rPr>
+                <w:b/>
+              </w:rPr>
+              <w:t>GitHub Repository Link</w:t>
+            </w:r>
+          </w:p>
+        </w:tc>
+        <w:tc>
+          <w:tcPr>
+            <w:tcW w:type="dxa" w:w="4680"/>
+          </w:tcPr>
+          <w:p>
+            <w:r>
+              <w:t>https://github.com/Surajgore007/Darukaa.Earth-Fullstack-project</w:t>
+            </w:r>
+          </w:p>
+        </w:tc>
+      </w:tr>
+      <w:tr>
+        <w:tc>
+          <w:tcPr>
+            <w:tcW w:type="dxa" w:w="4680"/>
+            <w:shd w:val="clear" w:color="auto" w:fill="EAEFEA"/>
+          </w:tcPr>
+          <w:p>
+            <w:r>
+              <w:rPr>
+                <w:b/>
+              </w:rPr>
+              <w:t>Live Demo Web Application</w:t>
+            </w:r>
+          </w:p>
+        </w:tc>
+        <w:tc>
+          <w:tcPr>
+            <w:tcW w:type="dxa" w:w="4680"/>
+          </w:tcPr>
+          <w:p>
+            <w:r>
+              <w:t>https://darukaa-earth-fullstack-project.vercel.app</w:t>
+            </w:r>
+          </w:p>
+        </w:tc>
+      </w:tr>
+      <w:tr>
+        <w:tc>
+          <w:tcPr>
+            <w:tcW w:type="dxa" w:w="4680"/>
+            <w:shd w:val="clear" w:color="auto" w:fill="EAEFEA"/>
+          </w:tcPr>
+          <w:p>
+            <w:r>
+              <w:rPr>
+                <w:b/>
+              </w:rPr>
+              <w:t>Live Backend API</w:t>
+            </w:r>
+          </w:p>
+        </w:tc>
+        <w:tc>
+          <w:tcPr>
+            <w:tcW w:type="dxa" w:w="4680"/>
+          </w:tcPr>
+          <w:p>
+            <w:r>
+              <w:t>https://darukaa-earth-api-amber.vercel.app</w:t>
+            </w:r>
+          </w:p>
+        </w:tc>
+      </w:tr>
+      <w:tr>
+        <w:tc>
+          <w:tcPr>
+            <w:tcW w:type="dxa" w:w="4680"/>
+            <w:shd w:val="clear" w:color="auto" w:fill="EAEFEA"/>
+          </w:tcPr>
+          <w:p>
+            <w:r>
+              <w:rPr>
+                <w:b/>
+              </w:rPr>
+              <w:t>Interactive API Docs (Swagger)</w:t>
+            </w:r>
+          </w:p>
+        </w:tc>
+        <w:tc>
+          <w:tcPr>
+            <w:tcW w:type="dxa" w:w="4680"/>
+          </w:tcPr>
+          <w:p>
+            <w:r>
+              <w:t>https://darukaa-earth-api-amber.vercel.app/docs</w:t>
+            </w:r>
+          </w:p>
+        </w:tc>
+      </w:tr>
+      <w:tr>
+        <w:tc>
+          <w:tcPr>
+            <w:tcW w:type="dxa" w:w="4680"/>
+            <w:shd w:val="clear" w:color="auto" w:fill="EAEFEA"/>
+          </w:tcPr>
+          <w:p>
+            <w:r>
+              <w:rPr>
+                <w:b/>
+              </w:rPr>
+              <w:t>API Health Status</w:t>
+            </w:r>
+          </w:p>
+        </w:tc>
+        <w:tc>
+          <w:tcPr>
+            <w:tcW w:type="dxa" w:w="4680"/>
+          </w:tcPr>
+          <w:p>
+            <w:r>
+              <w:t>https://darukaa-earth-api-amber.vercel.app/health</w:t>
+            </w:r>
+          </w:p>
+        </w:tc>
+      </w:tr>
+    </w:tbl>
+    <w:p/>
     <w:p>
       <w:pPr>
         <w:pStyle w:val="Heading1"/>
       </w:pPr>
       <w:r>
-        <w:t>2. Reviewer Access &amp; Demonstration Credentials</w:t>
+        <w:t>2. Reviewer Access &amp; Pre-Seeded Credentials</w:t>
       </w:r>
     </w:p>
     <w:p>
       <w:r>
-        <w:t>A pre-seeded demonstration account is configured to enable immediate evaluation of all user stories, including existing projects, interactive Mapbox polygon sites, and 12-month time-series analytics charts:</w:t>
+        <w:t>A pre-seeded demonstration account is active on both the live cloud environment and local database seeds to enable instant evaluation of all user stories without manual onboarding:</w:t>
       </w:r>
     </w:p>
     <w:tbl>
@@ -172,7 +320,7 @@
               <w:rPr>
                 <w:b/>
               </w:rPr>
-              <w:t>Pre-Loaded Restoration Project</w:t>
+              <w:t>Pre-Loaded Restoration Workspace</w:t>
             </w:r>
           </w:p>
         </w:tc>
@@ -182,7 +330,7 @@
           </w:tcPr>
           <w:p>
             <w:r>
-              <w:t>Western Ghats Restoration (featuring Kudremukh Ridge site with 12 months of carbon, biodiversity, and canopy cover data)</w:t>
+              <w:t>Western Ghats Restoration (includes Kudremukh Ridge site with 12 months of carbon, biodiversity, and canopy cover time-series analytics)</w:t>
             </w:r>
           </w:p>
         </w:tc>
@@ -191,7 +339,7 @@
     <w:p/>
     <w:p>
       <w:r>
-        <w:t>For private repository auditing, permissions have also been configured for the official Darukaa evaluator team:</w:t>
+        <w:t>Repository Access: The GitHub repository is configured as Public for direct evaluation without requiring access invitations. Furthermore, permissions have been designated for the official Darukaa evaluator team:</w:t>
       </w:r>
     </w:p>
     <w:p>
@@ -236,7 +384,7 @@
     </w:p>
     <w:p>
       <w:r>
-        <w:t>The application satisfies all five challenge requirements with production-grade engineering:</w:t>
+        <w:t>The application satisfies all core business requirements and key features specified in the challenge brief:</w:t>
       </w:r>
     </w:p>
     <w:p>
@@ -250,7 +398,7 @@
         <w:t xml:space="preserve">User Authentication: </w:t>
       </w:r>
       <w:r>
-        <w:t>Secure JWT token authentication with bcrypt password hashing, 60-minute token lifetimes, and protected client-side route guards powered by Zustand and Axios interceptors.</w:t>
+        <w:t>Secure user registration and login powered by FastAPI, bcrypt password hashing, and JWT tokens (60-minute expiration). The frontend utilizes Zustand with Axios authorization request interceptors to protect authenticated routes.</w:t>
       </w:r>
     </w:p>
     <w:p>
@@ -264,7 +412,7 @@
         <w:t xml:space="preserve">Project Management Dashboard: </w:t>
       </w:r>
       <w:r>
-        <w:t>Administrative interface to create, list, inspect, and update restoration project workspaces (e.g. Reforestation, Wetland Rehabilitation, Agroforestry).</w:t>
+        <w:t>Interactive dashboard allowing administrators to create, list, view, and organize ecological restoration projects (e.g., Reforestation, Wetland Rehabilitation, Agroforestry).</w:t>
       </w:r>
     </w:p>
     <w:p>
@@ -275,10 +423,10 @@
         <w:rPr>
           <w:b/>
         </w:rPr>
-        <w:t xml:space="preserve">Interactive Geospatial Mapping: </w:t>
+        <w:t xml:space="preserve">Geospatial Site Creation via Interactive Map: </w:t>
       </w:r>
       <w:r>
-        <w:t>Mapbox GL JS integration with custom Outdoors styling and vector tile layers. Administrators can draw multi-vertex vector polygons using Mapbox GL Draw, which are parsed and stored as native PostGIS POLYGON (SRID 4326) geometries.</w:t>
+        <w:t>Full Mapbox GL JS integration with vector layers. Administrators draw multi-vertex spatial polygons using Mapbox GL Draw. The coordinates are parsed, validated, and stored as native PostGIS POLYGON (SRID 4326) geometries with automated surface area calculation in hectares.</w:t>
       </w:r>
     </w:p>
     <w:p>
@@ -289,10 +437,10 @@
         <w:rPr>
           <w:b/>
         </w:rPr>
-        <w:t xml:space="preserve">Site Performance Visualizations: </w:t>
+        <w:t xml:space="preserve">Site Performance &amp; Time-Series Data Visualization: </w:t>
       </w:r>
       <w:r>
-        <w:t>Site-specific detail dashboards featuring responsive, animated time-series analytics (Carbon Sequestered in Tonnes, Biodiversity Index score 0-100, and Forest Canopy Density %) dynamically rendered using Chart.js / react-chartjs-2.</w:t>
+        <w:t>Detailed site analytics views presenting multi-metric time-series curves (Carbon Sequestered in Tonnes, Biodiversity Index score 0-100, and Forest Canopy Density %) dynamically rendered using Chart.js with responsive canvas layouts and custom tooltips.</w:t>
       </w:r>
     </w:p>
     <w:p>
@@ -303,10 +451,10 @@
         <w:rPr>
           <w:b/>
         </w:rPr>
-        <w:t xml:space="preserve">Automated Code Quality &amp; DX: </w:t>
+        <w:t xml:space="preserve">Automated Code Quality &amp; Pre-Commit Checks: </w:t>
       </w:r>
       <w:r>
-        <w:t>Husky and lint-staged pre-commit hooks that strictly format and lint staged TypeScript/React files (ESLint, Prettier) and Python backend code (Ruff, Black, Pytest) prior to committing.</w:t>
+        <w:t>Husky and lint-staged pre-commit hooks that strictly format and lint staged TypeScript/React files (ESLint, Prettier) and Python backend code (Ruff, Black, Pytest) prior to git commits.</w:t>
       </w:r>
     </w:p>
     <w:p>
@@ -314,22 +462,50 @@
         <w:pStyle w:val="Heading1"/>
       </w:pPr>
       <w:r>
-        <w:t>4. System Architecture</w:t>
+        <w:t>4. System Architecture &amp; High-Level Design</w:t>
       </w:r>
     </w:p>
     <w:p>
       <w:r>
-        <w:t>The architecture adheres strictly to the required full-stack design patterns:</w:t>
+        <w:t>The system follows a modern decoupled full-stack architecture:</w:t>
         <w:br/>
-        <w:t>• Client: React 18 SPA built with Vite and TypeScript, styling with clean modern CSS, Mapbox GL JS for spatial mapping, and Chart.js for time-series visualization.</w:t>
         <w:br/>
-        <w:t>• Backend API: Python FastAPI asynchronous application with Pydantic v2 schemas and JWT authentication.</w:t>
+        <w:t>1. Client Tier (React 18 + Vite + TypeScript):</w:t>
         <w:br/>
-        <w:t>• Object Relational Mapping (ORM): SQLAlchemy 2.0 coupled with GeoAlchemy2 for native geospatial abstraction.</w:t>
+        <w:t xml:space="preserve">   - Mapbox GL JS &amp; Mapbox Draw for interactive spatial map rendering and polygon geometry capture.</w:t>
         <w:br/>
-        <w:t>• Database: PostgreSQL with PostGIS extension (hosted via Supabase cloud with connection pooling).</w:t>
+        <w:t xml:space="preserve">   - Chart.js &amp; react-chartjs-2 for reactive time-series data visualization.</w:t>
         <w:br/>
-        <w:t>• CI/CD: Automated GitHub Actions pipeline validating linting, formatting, schema migrations, and unit tests against a live containerized PostGIS instance.</w:t>
+        <w:t xml:space="preserve">   - Zustand for lightweight client authentication and session state.</w:t>
+        <w:br/>
+        <w:t xml:space="preserve">   - Axios client with bearer token interception and automatic error handling.</w:t>
+        <w:br/>
+        <w:br/>
+        <w:t>2. Backend API Tier (Python FastAPI):</w:t>
+        <w:br/>
+        <w:t xml:space="preserve">   - High-throughput asynchronous REST endpoints (/api/v1).</w:t>
+        <w:br/>
+        <w:t xml:space="preserve">   - Strict request/response validation using Pydantic v2 schemas.</w:t>
+        <w:br/>
+        <w:t xml:space="preserve">   - SQLAlchemy 2.0 ORM with GeoAlchemy2 for native spatial SQL operations.</w:t>
+        <w:br/>
+        <w:t xml:space="preserve">   - Passlib + Bcrypt for password security and python-jose for JWT token generation.</w:t>
+        <w:br/>
+        <w:br/>
+        <w:t>3. Database Tier (PostgreSQL + PostGIS via Supabase):</w:t>
+        <w:br/>
+        <w:t xml:space="preserve">   - Relational database schema with PostGIS extension enabled.</w:t>
+        <w:br/>
+        <w:t xml:space="preserve">   - Native geometric columns with SRID 4326 (WGS 84 coordinate reference system).</w:t>
+        <w:br/>
+        <w:t xml:space="preserve">   - Session connection pooling configured for serverless compatibility.</w:t>
+        <w:br/>
+        <w:br/>
+        <w:t>4. CI/CD &amp; Deployment:</w:t>
+        <w:br/>
+        <w:t xml:space="preserve">   - GitHub Actions workflow running containerized PostGIS integration tests, code linters, and type checkers.</w:t>
+        <w:br/>
+        <w:t xml:space="preserve">   - Continuous deployment to Vercel production edge infrastructure.</w:t>
       </w:r>
     </w:p>
     <w:p>
@@ -342,7 +518,7 @@
     </w:p>
     <w:p>
       <w:r>
-        <w:t>The database is structured in Third Normal Form (3NF) and managed via Alembic migrations. Geospatial data is preserved as true geometric entities rather than raw text blobs:</w:t>
+        <w:t>The relational database schema is normalized and version-controlled via Alembic migrations. Geospatial boundaries are persisted as native geometries rather than raw text or JSON:</w:t>
       </w:r>
     </w:p>
     <w:tbl>
@@ -434,7 +610,7 @@
           </w:tcPr>
           <w:p>
             <w:r>
-              <w:t>Parent entity. One User owns multiple Projects.</w:t>
+              <w:t>Parent entity. One user owns multiple restoration projects.</w:t>
             </w:r>
           </w:p>
         </w:tc>
@@ -472,7 +648,7 @@
           </w:tcPr>
           <w:p>
             <w:r>
-              <w:t>Owned by User. One Project contains multiple Sites.</w:t>
+              <w:t>Belongs to User. One project contains multiple geographical sites.</w:t>
             </w:r>
           </w:p>
         </w:tc>
@@ -510,7 +686,7 @@
           </w:tcPr>
           <w:p>
             <w:r>
-              <w:t>Owned by Project. Spatial boundary indexed and verified by PostGIS.</w:t>
+              <w:t>Belongs to Project. Spatial boundary validated and indexed by PostGIS.</w:t>
             </w:r>
           </w:p>
         </w:tc>
@@ -548,7 +724,7 @@
           </w:tcPr>
           <w:p>
             <w:r>
-              <w:t>Monthly time-series records owned by Site.</w:t>
+              <w:t>Monthly time-series records owned by Site for Chart.js rendering.</w:t>
             </w:r>
           </w:p>
         </w:tc>
@@ -560,20 +736,20 @@
         <w:pStyle w:val="Heading1"/>
       </w:pPr>
       <w:r>
-        <w:t>6. CI/CD Pipeline &amp; Developer Experience</w:t>
+        <w:t>6. CI/CD Pipeline &amp; Pre-Commit Code Quality</w:t>
       </w:r>
     </w:p>
     <w:p>
       <w:r>
-        <w:t>A multi-stage GitHub Actions workflow (.github/workflows/ci-cd.yml) enforces code quality on every pull request and push to main:</w:t>
+        <w:t>A multi-stage GitHub Actions workflow (.github/workflows/ci-cd.yml) enforces production standards on every pull request and push to main:</w:t>
         <w:br/>
-        <w:t>1. Service Container Initialization: Boots an official postgis/postgis:16-3.4 container in GitHub Actions.</w:t>
+        <w:t>• Service Container Initialization: Boots an official postgis/postgis:16-3.4 container service.</w:t>
         <w:br/>
-        <w:t>2. Backend Verification: Runs alembic upgrade head to test schema migrations against real PostGIS, runs ruff check and black --check, and executes pytest unit tests.</w:t>
+        <w:t>• Backend Verification: Runs alembic upgrade head to test schema migrations against real PostGIS, executes ruff check, black --check, and runs pytest unit tests.</w:t>
         <w:br/>
-        <w:t>3. Frontend Verification: Runs npm ci, eslint ., tsc --noEmit (strict TypeScript typechecking), and npm run build.</w:t>
+        <w:t>• Frontend Verification: Runs npm ci, eslint ., tsc --noEmit (strict TypeScript typechecking), and npm run build.</w:t>
         <w:br/>
-        <w:t>4. Deployment Automation: Automatically deploys the frontend and backend upon merge to main.</w:t>
+        <w:t>• Automated Pre-Commit Hooks: Configured using Husky and lint-staged to ensure no unformatted or lint-failing code can ever be committed locally.</w:t>
       </w:r>
     </w:p>
     <w:p>
@@ -599,7 +775,7 @@
         <w:br/>
         <w:t xml:space="preserve">  pip install -r requirements.txt</w:t>
         <w:br/>
-        <w:t xml:space="preserve">  cp .env.example .env  # Set DATABASE_URL and SECRET_KEY</w:t>
+        <w:t xml:space="preserve">  cp .env.example .env  # Configure DATABASE_URL and SECRET_KEY</w:t>
         <w:br/>
         <w:t xml:space="preserve">  alembic upgrade head</w:t>
         <w:br/>
@@ -617,6 +793,13 @@
         <w:t xml:space="preserve">  cp .env.example .env  # Set VITE_API_URL=http://localhost:8000/api/v1 and VITE_MAPBOX_TOKEN</w:t>
         <w:br/>
         <w:t xml:space="preserve">  npm run dev</w:t>
+        <w:br/>
+        <w:br/>
+        <w:t>Access:</w:t>
+        <w:br/>
+        <w:t xml:space="preserve">  Frontend: http://localhost:5173</w:t>
+        <w:br/>
+        <w:t xml:space="preserve">  Backend Swagger Docs: http://localhost:8000/docs</w:t>
       </w:r>
     </w:p>
     <w:p>
@@ -629,13 +812,13 @@
     </w:p>
     <w:p>
       <w:r>
-        <w:t>• Native PostGIS vs. JSON Geometries: Storing spatial data as PostGIS POLYGON (SRID 4326) enables spatial indexing, bounding box intersections, and automated area calculations directly at the SQL level, avoiding heavy in-memory Python calculations.</w:t>
+        <w:t>• Native PostGIS vs. Plain JSON Coordinates: By storing boundaries as native PostGIS POLYGON geometries with SRID 4326, the application leverages SQL-level spatial calculations (ST_Area, ST_Contains, ST_Intersects) rather than inefficient in-memory Python math.</w:t>
         <w:br/>
-        <w:t>• FastAPI vs. Django: FastAPI was chosen for lightweight execution, rapid cold-start times, native Pydantic validation, and automated OpenAPI documentation.</w:t>
+        <w:t>• FastAPI vs. Traditional Frameworks: Chosen for native async support, automated OpenAPI 3.0 documentation, and rapid cold-start performance in cloud serverless deployments.</w:t>
         <w:br/>
-        <w:t>• Chart.js vs. Heavy BI Tools: Chart.js was selected for crisp canvas-based time-series rendering with smooth Bézier curve interpolation and zero runtime overhead.</w:t>
+        <w:t>• Chart.js vs. Heavyweight BI Tools: Selected for crisp canvas rendering, smooth Bézier curves, zero bundle bloat, and seamless integration with React hooks.</w:t>
         <w:br/>
-        <w:t>• Synthetic Data Transparency: In alignment with the challenge prompt ('feel free to use any datasets and document why this choice was made'), 12-month synthetic metrics were generated to provide reviewers with immediate, observable trends without requiring third-party sensor hardware.</w:t>
+        <w:t>• Synthetic Time-Series Disclosure: As allowed in the challenge prompt ('feel free to use any datasets and document why this choice was made'), 12-month synthetic metrics were created to give reviewers immediate visibility into ecological progress indicators without dependency on proprietary IoT hardware.</w:t>
       </w:r>
     </w:p>
     <w:sectPr>

</xml_diff>

<commit_message>
docs: regenerate submission document with native clickable hyperlinks
</commit_message>
<xml_diff>
--- a/Darukaa_Earth_FullStack_Submission.docx
+++ b/Darukaa_Earth_FullStack_Submission.docx
@@ -11,7 +11,7 @@
           <w:color w:val="1B4D3E"/>
           <w:sz w:val="44"/>
         </w:rPr>
-        <w:t>Darukaa.Earth — Full-Stack Developer Hackathon Challenge Submission</w:t>
+        <w:t>Darukaa.Earth - Full-Stack Developer Hackathon Challenge Submission</w:t>
       </w:r>
     </w:p>
     <w:p>
@@ -69,6 +69,7 @@
             <w:tcW w:type="dxa" w:w="4680"/>
           </w:tcPr>
           <w:p>
+            <w:r/>
             <w:r>
               <w:t>Suraj Gore</w:t>
             </w:r>
@@ -95,8 +96,9 @@
             <w:tcW w:type="dxa" w:w="4680"/>
           </w:tcPr>
           <w:p>
+            <w:r/>
             <w:r>
-              <w:t>Darukaa.Earth — Full-Stack Geospatial Data Analytics Platform</w:t>
+              <w:t>Darukaa.Earth - Full-Stack Geospatial Data Analytics Platform</w:t>
             </w:r>
           </w:p>
         </w:tc>
@@ -121,9 +123,16 @@
             <w:tcW w:type="dxa" w:w="4680"/>
           </w:tcPr>
           <w:p>
-            <w:r>
-              <w:t>https://github.com/Surajgore007/Darukaa.Earth-Fullstack-project</w:t>
-            </w:r>
+            <w:r/>
+            <w:hyperlink r:id="rId9">
+              <w:r>
+                <w:rPr>
+                  <w:color w:val="0563C1"/>
+                  <w:u w:val="single"/>
+                </w:rPr>
+                <w:t>https://github.com/Surajgore007/Darukaa.Earth-Fullstack-project</w:t>
+              </w:r>
+            </w:hyperlink>
           </w:p>
         </w:tc>
       </w:tr>
@@ -147,9 +156,16 @@
             <w:tcW w:type="dxa" w:w="4680"/>
           </w:tcPr>
           <w:p>
-            <w:r>
-              <w:t>https://darukaa-earth-fullstack-project.vercel.app</w:t>
-            </w:r>
+            <w:r/>
+            <w:hyperlink r:id="rId10">
+              <w:r>
+                <w:rPr>
+                  <w:color w:val="0563C1"/>
+                  <w:u w:val="single"/>
+                </w:rPr>
+                <w:t>https://darukaa-earth-fullstack-project.vercel.app</w:t>
+              </w:r>
+            </w:hyperlink>
           </w:p>
         </w:tc>
       </w:tr>
@@ -173,9 +189,16 @@
             <w:tcW w:type="dxa" w:w="4680"/>
           </w:tcPr>
           <w:p>
-            <w:r>
-              <w:t>https://darukaa-earth-api-amber.vercel.app</w:t>
-            </w:r>
+            <w:r/>
+            <w:hyperlink r:id="rId11">
+              <w:r>
+                <w:rPr>
+                  <w:color w:val="0563C1"/>
+                  <w:u w:val="single"/>
+                </w:rPr>
+                <w:t>https://darukaa-earth-api-amber.vercel.app</w:t>
+              </w:r>
+            </w:hyperlink>
           </w:p>
         </w:tc>
       </w:tr>
@@ -199,9 +222,16 @@
             <w:tcW w:type="dxa" w:w="4680"/>
           </w:tcPr>
           <w:p>
-            <w:r>
-              <w:t>https://darukaa-earth-api-amber.vercel.app/docs</w:t>
-            </w:r>
+            <w:r/>
+            <w:hyperlink r:id="rId12">
+              <w:r>
+                <w:rPr>
+                  <w:color w:val="0563C1"/>
+                  <w:u w:val="single"/>
+                </w:rPr>
+                <w:t>https://darukaa-earth-api-amber.vercel.app/docs</w:t>
+              </w:r>
+            </w:hyperlink>
           </w:p>
         </w:tc>
       </w:tr>
@@ -225,9 +255,16 @@
             <w:tcW w:type="dxa" w:w="4680"/>
           </w:tcPr>
           <w:p>
-            <w:r>
-              <w:t>https://darukaa-earth-api-amber.vercel.app/health</w:t>
-            </w:r>
+            <w:r/>
+            <w:hyperlink r:id="rId13">
+              <w:r>
+                <w:rPr>
+                  <w:color w:val="0563C1"/>
+                  <w:u w:val="single"/>
+                </w:rPr>
+                <w:t>https://darukaa-earth-api-amber.vercel.app/health</w:t>
+              </w:r>
+            </w:hyperlink>
           </w:p>
         </w:tc>
       </w:tr>

</xml_diff>